<commit_message>
Add job search integration, update UI, and refresh all project documents
- Add NEXT_PUBLIC_JOB_SEARCH_URL env var to Dockerfile and both compose files
  (local: http://18.216.104.26, prod: http://apply.careerpaq.com)
- Add job search cross-promotion banner to welcome overlay and workspace sidebar
- Fix welcome overlay layout: remove hasAnyInput variable, inline status text
- Fix workspace header: logo and label now inline instead of stacked
- Update README.md with job search section and env var reference table
- Update NEXT_STEPS.md: mark all Docker/export items complete, add new priorities
- Rewrite all 5 .docx documents (architecture, business plan, developer guide,
  process flow, user guide) to reflect CareerPaq branding, current tech stack
  (Next.js + FastAPI), actual API endpoints, and Docker/EC2 deployment

Co-Authored-By: Claude Sonnet 4.6 <noreply@anthropic.com>
</commit_message>
<xml_diff>
--- a/architecture_design.docx
+++ b/architecture_design.docx
@@ -4,75 +4,439 @@
   <w:body>
     <w:p>
       <w:pPr>
-        <w:pStyle w:val="Title"/>
+        <w:pStyle w:val="Heading1"/>
       </w:pPr>
       <w:r>
-        <w:t>Resume Co-Pilot - Architecture Design</w:t>
+        <w:t>CareerPaq - Architecture Design</w:t>
       </w:r>
     </w:p>
     <w:p>
       <w:pPr>
-        <w:pStyle w:val="Heading1"/>
+        <w:pStyle w:val="Heading2"/>
+      </w:pPr>
+      <w:r>
+        <w:t>Overview</w:t>
+      </w:r>
+    </w:p>
+    <w:p>
+      <w:r>
+        <w:t>CareerPaq is a privacy-first AI-powered resume builder built as a Next.js + FastAPI monorepo. There is no persistent database. All session data lives in server memory and expires automatically.</w:t>
+      </w:r>
+    </w:p>
+    <w:p>
+      <w:pPr>
+        <w:pStyle w:val="Heading2"/>
+      </w:pPr>
+      <w:r>
+        <w:t>Monorepo Structure</w:t>
+      </w:r>
+    </w:p>
+    <w:p>
+      <w:pPr>
+        <w:pStyle w:val="ListBullet"/>
+      </w:pPr>
+      <w:r>
+        <w:t>apps/web  - Next.js 14 frontend (TypeScript, Tailwind CSS)</w:t>
+      </w:r>
+    </w:p>
+    <w:p>
+      <w:pPr>
+        <w:pStyle w:val="ListBullet"/>
+      </w:pPr>
+      <w:r>
+        <w:t>apps/api  - FastAPI backend (Python 3.11+)</w:t>
+      </w:r>
+    </w:p>
+    <w:p>
+      <w:pPr>
+        <w:pStyle w:val="ListBullet"/>
+      </w:pPr>
+      <w:r>
+        <w:t>docker-compose.yml       - local full-stack development</w:t>
+      </w:r>
+    </w:p>
+    <w:p>
+      <w:pPr>
+        <w:pStyle w:val="ListBullet"/>
+      </w:pPr>
+      <w:r>
+        <w:t>docker-compose.prod.yml  - EC2 production deployment</w:t>
+      </w:r>
+    </w:p>
+    <w:p>
+      <w:pPr>
+        <w:pStyle w:val="Heading2"/>
       </w:pPr>
       <w:r>
         <w:t>Frontend</w:t>
       </w:r>
     </w:p>
     <w:p>
+      <w:pPr>
+        <w:pStyle w:val="ListBullet"/>
+      </w:pPr>
       <w:r>
-        <w:t>React + Next.js + Tailwind + WebSocket.</w:t>
+        <w:t>Framework: Next.js 14 (App Router), TypeScript, Tailwind CSS</w:t>
       </w:r>
     </w:p>
     <w:p>
       <w:pPr>
-        <w:pStyle w:val="Heading1"/>
+        <w:pStyle w:val="ListBullet"/>
+      </w:pPr>
+      <w:r>
+        <w:t>Port: 3001 (local), 80/443 (production via reverse proxy)</w:t>
+      </w:r>
+    </w:p>
+    <w:p>
+      <w:pPr>
+        <w:pStyle w:val="ListBullet"/>
+      </w:pPr>
+      <w:r>
+        <w:t>Key env var: NEXT_PUBLIC_API_BASE_URL - backend URL (default http://localhost:8001)</w:t>
+      </w:r>
+    </w:p>
+    <w:p>
+      <w:pPr>
+        <w:pStyle w:val="ListBullet"/>
+      </w:pPr>
+      <w:r>
+        <w:t>Key env var: NEXT_PUBLIC_JOB_SEARCH_URL - job search cross-link (apply.careerpaq.com in prod)</w:t>
+      </w:r>
+    </w:p>
+    <w:p>
+      <w:pPr>
+        <w:pStyle w:val="ListBullet"/>
+      </w:pPr>
+      <w:r>
+        <w:t>Pages: single-page app with welcome overlay + workspace panels</w:t>
+      </w:r>
+    </w:p>
+    <w:p>
+      <w:pPr>
+        <w:pStyle w:val="ListBullet"/>
+      </w:pPr>
+      <w:r>
+        <w:t>Exports: Markdown, JSON, DOCX, PDF</w:t>
+      </w:r>
+    </w:p>
+    <w:p>
+      <w:pPr>
+        <w:pStyle w:val="Heading2"/>
       </w:pPr>
       <w:r>
         <w:t>Backend</w:t>
       </w:r>
     </w:p>
     <w:p>
+      <w:pPr>
+        <w:pStyle w:val="ListBullet"/>
+      </w:pPr>
       <w:r>
-        <w:t>FastAPI + Redis (TTL sessions) + Pydantic.</w:t>
+        <w:t>Framework: FastAPI, Python 3.11</w:t>
       </w:r>
     </w:p>
     <w:p>
       <w:pPr>
-        <w:pStyle w:val="Heading1"/>
+        <w:pStyle w:val="ListBullet"/>
+      </w:pPr>
+      <w:r>
+        <w:t>Port: 8001 (local and Docker)</w:t>
+      </w:r>
+    </w:p>
+    <w:p>
+      <w:pPr>
+        <w:pStyle w:val="ListBullet"/>
+      </w:pPr>
+      <w:r>
+        <w:t>Session store: MemorySessionStore - TTL-based in-memory dict</w:t>
+      </w:r>
+    </w:p>
+    <w:p>
+      <w:pPr>
+        <w:pStyle w:val="ListBullet"/>
+      </w:pPr>
+      <w:r>
+        <w:t>AI providers: OpenAI (gpt-4o-mini default) and Anthropic Claude (claude-3-5-sonnet)</w:t>
+      </w:r>
+    </w:p>
+    <w:p>
+      <w:pPr>
+        <w:pStyle w:val="ListBullet"/>
+      </w:pPr>
+      <w:r>
+        <w:t>File ingestion: TXT, MD, DOCX, PDF via python-docx and pypdf</w:t>
+      </w:r>
+    </w:p>
+    <w:p>
+      <w:pPr>
+        <w:pStyle w:val="ListBullet"/>
+      </w:pPr>
+      <w:r>
+        <w:t>Audio: OpenAI Whisper transcription + Realtime API token endpoint</w:t>
+      </w:r>
+    </w:p>
+    <w:p>
+      <w:pPr>
+        <w:pStyle w:val="ListBullet"/>
+      </w:pPr>
+      <w:r>
+        <w:t>Export: python-docx (DOCX), reportlab (PDF)</w:t>
+      </w:r>
+    </w:p>
+    <w:p>
+      <w:pPr>
+        <w:pStyle w:val="Heading2"/>
+      </w:pPr>
+      <w:r>
+        <w:t>API Endpoints</w:t>
+      </w:r>
+    </w:p>
+    <w:p>
+      <w:pPr>
+        <w:pStyle w:val="ListBullet"/>
+      </w:pPr>
+      <w:r>
+        <w:t>GET  /health</w:t>
+      </w:r>
+    </w:p>
+    <w:p>
+      <w:pPr>
+        <w:pStyle w:val="ListBullet"/>
+      </w:pPr>
+      <w:r>
+        <w:t>POST /sessions</w:t>
+      </w:r>
+    </w:p>
+    <w:p>
+      <w:pPr>
+        <w:pStyle w:val="ListBullet"/>
+      </w:pPr>
+      <w:r>
+        <w:t>POST /uploads/extract</w:t>
+      </w:r>
+    </w:p>
+    <w:p>
+      <w:pPr>
+        <w:pStyle w:val="ListBullet"/>
+      </w:pPr>
+      <w:r>
+        <w:t>POST /audio/transcribe</w:t>
+      </w:r>
+    </w:p>
+    <w:p>
+      <w:pPr>
+        <w:pStyle w:val="ListBullet"/>
+      </w:pPr>
+      <w:r>
+        <w:t>POST /audio/realtime-token</w:t>
+      </w:r>
+    </w:p>
+    <w:p>
+      <w:pPr>
+        <w:pStyle w:val="ListBullet"/>
+      </w:pPr>
+      <w:r>
+        <w:t>GET  /sessions/{id}</w:t>
+      </w:r>
+    </w:p>
+    <w:p>
+      <w:pPr>
+        <w:pStyle w:val="ListBullet"/>
+      </w:pPr>
+      <w:r>
+        <w:t>POST /sessions/{id}/intake</w:t>
+      </w:r>
+    </w:p>
+    <w:p>
+      <w:pPr>
+        <w:pStyle w:val="ListBullet"/>
+      </w:pPr>
+      <w:r>
+        <w:t>POST /sessions/{id}/questions</w:t>
+      </w:r>
+    </w:p>
+    <w:p>
+      <w:pPr>
+        <w:pStyle w:val="ListBullet"/>
+      </w:pPr>
+      <w:r>
+        <w:t>POST /sessions/{id}/facts</w:t>
+      </w:r>
+    </w:p>
+    <w:p>
+      <w:pPr>
+        <w:pStyle w:val="ListBullet"/>
+      </w:pPr>
+      <w:r>
+        <w:t>POST /sessions/{id}/answers</w:t>
+      </w:r>
+    </w:p>
+    <w:p>
+      <w:pPr>
+        <w:pStyle w:val="ListBullet"/>
+      </w:pPr>
+      <w:r>
+        <w:t>POST /sessions/{id}/resume</w:t>
+      </w:r>
+    </w:p>
+    <w:p>
+      <w:pPr>
+        <w:pStyle w:val="ListBullet"/>
+      </w:pPr>
+      <w:r>
+        <w:t>POST /sessions/{id}/resume/claude</w:t>
+      </w:r>
+    </w:p>
+    <w:p>
+      <w:pPr>
+        <w:pStyle w:val="ListBullet"/>
+      </w:pPr>
+      <w:r>
+        <w:t>POST /sessions/{id}/resume-draft</w:t>
+      </w:r>
+    </w:p>
+    <w:p>
+      <w:pPr>
+        <w:pStyle w:val="ListBullet"/>
+      </w:pPr>
+      <w:r>
+        <w:t>POST /sessions/{id}/review</w:t>
+      </w:r>
+    </w:p>
+    <w:p>
+      <w:pPr>
+        <w:pStyle w:val="ListBullet"/>
+      </w:pPr>
+      <w:r>
+        <w:t>POST /sessions/{id}/finalize</w:t>
+      </w:r>
+    </w:p>
+    <w:p>
+      <w:pPr>
+        <w:pStyle w:val="ListBullet"/>
+      </w:pPr>
+      <w:r>
+        <w:t>GET  /sessions/{id}/export/docx</w:t>
+      </w:r>
+    </w:p>
+    <w:p>
+      <w:pPr>
+        <w:pStyle w:val="ListBullet"/>
+      </w:pPr>
+      <w:r>
+        <w:t>GET  /sessions/{id}/export/json</w:t>
+      </w:r>
+    </w:p>
+    <w:p>
+      <w:pPr>
+        <w:pStyle w:val="ListBullet"/>
+      </w:pPr>
+      <w:r>
+        <w:t>GET  /sessions/{id}/export/pdf</w:t>
+      </w:r>
+    </w:p>
+    <w:p>
+      <w:pPr>
+        <w:pStyle w:val="Heading2"/>
       </w:pPr>
       <w:r>
         <w:t>AI Layer</w:t>
       </w:r>
     </w:p>
     <w:p>
+      <w:pPr>
+        <w:pStyle w:val="ListBullet"/>
+      </w:pPr>
       <w:r>
-        <w:t>Fact extraction, gap detection, conversational questioning, resume generation.</w:t>
+        <w:t>extract_facts - OpenAI, extracts structured resume facts from raw brain dump</w:t>
       </w:r>
     </w:p>
     <w:p>
       <w:pPr>
-        <w:pStyle w:val="Heading1"/>
+        <w:pStyle w:val="ListBullet"/>
       </w:pPr>
       <w:r>
-        <w:t>Storage</w:t>
-      </w:r>
-    </w:p>
-    <w:p>
-      <w:r>
-        <w:t>No persistent DB, only temporary session memory.</w:t>
+        <w:t>generate_questions - OpenAI, creates targeted follow-up questions</w:t>
       </w:r>
     </w:p>
     <w:p>
       <w:pPr>
-        <w:pStyle w:val="Heading1"/>
+        <w:pStyle w:val="ListBullet"/>
+      </w:pPr>
+      <w:r>
+        <w:t>build_resume - OpenAI, produces initial resume draft</w:t>
+      </w:r>
+    </w:p>
+    <w:p>
+      <w:pPr>
+        <w:pStyle w:val="ListBullet"/>
+      </w:pPr>
+      <w:r>
+        <w:t>claude_build_resume - Claude Sonnet, alternative specialist resume builder</w:t>
+      </w:r>
+    </w:p>
+    <w:p>
+      <w:pPr>
+        <w:pStyle w:val="ListBullet"/>
+      </w:pPr>
+      <w:r>
+        <w:t>review_resume - OpenAI, reviews draft against full transcript</w:t>
+      </w:r>
+    </w:p>
+    <w:p>
+      <w:pPr>
+        <w:pStyle w:val="ListBullet"/>
+      </w:pPr>
+      <w:r>
+        <w:t>apply_revision - OpenAI, applies plain-language user edit requests</w:t>
+      </w:r>
+    </w:p>
+    <w:p>
+      <w:pPr>
+        <w:pStyle w:val="ListBullet"/>
+      </w:pPr>
+      <w:r>
+        <w:t>transcribe_audio - OpenAI Whisper</w:t>
+      </w:r>
+    </w:p>
+    <w:p>
+      <w:pPr>
+        <w:pStyle w:val="Heading2"/>
       </w:pPr>
       <w:r>
         <w:t>Deployment</w:t>
       </w:r>
     </w:p>
     <w:p>
+      <w:pPr>
+        <w:pStyle w:val="ListBullet"/>
+      </w:pPr>
       <w:r>
-        <w:t>Vercel + AWS Fargate + Redis.</w:t>
+        <w:t>Local: docker compose up --build</w:t>
+      </w:r>
+    </w:p>
+    <w:p>
+      <w:pPr>
+        <w:pStyle w:val="ListBullet"/>
+      </w:pPr>
+      <w:r>
+        <w:t>Production: EC2 instance, docker-compose.prod.yml</w:t>
+      </w:r>
+    </w:p>
+    <w:p>
+      <w:pPr>
+        <w:pStyle w:val="ListBullet"/>
+      </w:pPr>
+      <w:r>
+        <w:t>Production API base: /api (Nginx reverse proxy in front)</w:t>
+      </w:r>
+    </w:p>
+    <w:p>
+      <w:pPr>
+        <w:pStyle w:val="ListBullet"/>
+      </w:pPr>
+      <w:r>
+        <w:t>Job search service: http://apply.careerpaq.com (separate service, linked via env var)</w:t>
       </w:r>
     </w:p>
     <w:sectPr>

</xml_diff>